<commit_message>
docs(bd): re-hone Islander/Gwaii with named live teaming triggers
Re-honed intel + regenerated 3 docs. Cross-referenced KOR's live pipeline
against Gwaii's incumbent clients -> named the specific pursuits to team on:
Duncan River's Edge (Cowichan Tribes + BC Housing), Saanichton Tsawout First
Nation, Vancouver Island BC Housing (Nanaimo/Saanich/Campbell River),
Penticton Skaha (PURSUE_URGENT). Updated IntelNarrative (Action) + new
KOR_OPPORTUNITY signal for both orgs (decomposed, dedup clean). Exec brief
stays 1 page (verified via PDF render).

Co-Authored-By: Claude Opus 4.8 <noreply@anthropic.com>
</commit_message>
<xml_diff>
--- a/docs/KOR-Gwaii-Engineering-Dossier-2026-06-23.docx
+++ b/docs/KOR-Gwaii-Engineering-Dossier-2026-06-23.docx
@@ -219,6 +219,12 @@
         <w:gridCol w:w="3200"/>
       </w:tblGrid>
       <w:tr>
+        <w:tblPrEx>
+          <w:tblCellMar>
+            <w:top w:w="0" w:type="dxa"/>
+            <w:bottom w:w="0" w:type="dxa"/>
+          </w:tblCellMar>
+        </w:tblPrEx>
         <w:tc>
           <w:tcPr>
             <w:tcW w:w="2400" w:type="dxa"/>
@@ -314,6 +320,12 @@
         </w:tc>
       </w:tr>
       <w:tr>
+        <w:tblPrEx>
+          <w:tblCellMar>
+            <w:top w:w="0" w:type="dxa"/>
+            <w:bottom w:w="0" w:type="dxa"/>
+          </w:tblCellMar>
+        </w:tblPrEx>
         <w:tc>
           <w:tcPr>
             <w:tcW w:w="2400" w:type="dxa"/>
@@ -400,6 +412,12 @@
         </w:tc>
       </w:tr>
       <w:tr>
+        <w:tblPrEx>
+          <w:tblCellMar>
+            <w:top w:w="0" w:type="dxa"/>
+            <w:bottom w:w="0" w:type="dxa"/>
+          </w:tblCellMar>
+        </w:tblPrEx>
         <w:tc>
           <w:tcPr>
             <w:tcW w:w="2400" w:type="dxa"/>
@@ -489,6 +507,12 @@
         </w:tc>
       </w:tr>
       <w:tr>
+        <w:tblPrEx>
+          <w:tblCellMar>
+            <w:top w:w="0" w:type="dxa"/>
+            <w:bottom w:w="0" w:type="dxa"/>
+          </w:tblCellMar>
+        </w:tblPrEx>
         <w:tc>
           <w:tcPr>
             <w:tcW w:w="2400" w:type="dxa"/>
@@ -575,6 +599,12 @@
         </w:tc>
       </w:tr>
       <w:tr>
+        <w:tblPrEx>
+          <w:tblCellMar>
+            <w:top w:w="0" w:type="dxa"/>
+            <w:bottom w:w="0" w:type="dxa"/>
+          </w:tblCellMar>
+        </w:tblPrEx>
         <w:tc>
           <w:tcPr>
             <w:tcW w:w="2400" w:type="dxa"/>
@@ -664,6 +694,12 @@
         </w:tc>
       </w:tr>
       <w:tr>
+        <w:tblPrEx>
+          <w:tblCellMar>
+            <w:top w:w="0" w:type="dxa"/>
+            <w:bottom w:w="0" w:type="dxa"/>
+          </w:tblCellMar>
+        </w:tblPrEx>
         <w:tc>
           <w:tcPr>
             <w:tcW w:w="2400" w:type="dxa"/>
@@ -985,7 +1021,6 @@
           <w:color w:val="002060"/>
           <w:sz w:val="20"/>
         </w:rPr>
-        <w:lastRenderedPageBreak/>
         <w:t xml:space="preserve">•  </w:t>
       </w:r>
       <w:r>
@@ -1050,7 +1085,7 @@
           <w:color w:val="000000"/>
           <w:sz w:val="20"/>
         </w:rPr>
-        <w:t>Warm-target the shared clients KOR is already chasing (Cowichan, Malahat, BC Housing) where Gwaii holds the relationship.</w:t>
+        <w:t>LIVE TRIGGERS - lead with a named project KOR is already pursuing on Gwaii-client land: Duncan 'River's Edge' (Cowichan Tribes + BC Housing), Saanichton (Tsawout First Nation, 7593 Tetayut Rd), the Vancouver Island BC Housing pursuits (Nanaimo, Saanich, Campbell River), or Penticton Skaha Assembly Redevelopment (PURSUE_URGENT). Ask whether Gwaii is already engaged and wants a structural partner.</w:t>
       </w:r>
     </w:p>
     <w:p>
@@ -1612,7 +1647,7 @@
     <w:link w:val="Heading1Char"/>
     <w:uiPriority w:val="9"/>
     <w:qFormat/>
-    <w:rsid w:val="00D57911"/>
+    <w:rsid w:val="00F908BF"/>
     <w:pPr>
       <w:keepNext/>
       <w:keepLines/>
@@ -1635,7 +1670,7 @@
     <w:semiHidden/>
     <w:unhideWhenUsed/>
     <w:qFormat/>
-    <w:rsid w:val="00D57911"/>
+    <w:rsid w:val="00F908BF"/>
     <w:pPr>
       <w:keepNext/>
       <w:keepLines/>
@@ -1658,7 +1693,7 @@
     <w:semiHidden/>
     <w:unhideWhenUsed/>
     <w:qFormat/>
-    <w:rsid w:val="00D57911"/>
+    <w:rsid w:val="00F908BF"/>
     <w:pPr>
       <w:keepNext/>
       <w:keepLines/>
@@ -1681,7 +1716,7 @@
     <w:semiHidden/>
     <w:unhideWhenUsed/>
     <w:qFormat/>
-    <w:rsid w:val="00D57911"/>
+    <w:rsid w:val="00F908BF"/>
     <w:pPr>
       <w:keepNext/>
       <w:keepLines/>
@@ -1704,7 +1739,7 @@
     <w:semiHidden/>
     <w:unhideWhenUsed/>
     <w:qFormat/>
-    <w:rsid w:val="00D57911"/>
+    <w:rsid w:val="00F908BF"/>
     <w:pPr>
       <w:keepNext/>
       <w:keepLines/>
@@ -1725,7 +1760,7 @@
     <w:semiHidden/>
     <w:unhideWhenUsed/>
     <w:qFormat/>
-    <w:rsid w:val="00D57911"/>
+    <w:rsid w:val="00F908BF"/>
     <w:pPr>
       <w:keepNext/>
       <w:keepLines/>
@@ -1748,7 +1783,7 @@
     <w:semiHidden/>
     <w:unhideWhenUsed/>
     <w:qFormat/>
-    <w:rsid w:val="00D57911"/>
+    <w:rsid w:val="00F908BF"/>
     <w:pPr>
       <w:keepNext/>
       <w:keepLines/>
@@ -1769,7 +1804,7 @@
     <w:semiHidden/>
     <w:unhideWhenUsed/>
     <w:qFormat/>
-    <w:rsid w:val="00D57911"/>
+    <w:rsid w:val="00F908BF"/>
     <w:pPr>
       <w:keepNext/>
       <w:keepLines/>
@@ -1792,7 +1827,7 @@
     <w:semiHidden/>
     <w:unhideWhenUsed/>
     <w:qFormat/>
-    <w:rsid w:val="00D57911"/>
+    <w:rsid w:val="00F908BF"/>
     <w:pPr>
       <w:keepNext/>
       <w:keepLines/>
@@ -1836,7 +1871,7 @@
     <w:basedOn w:val="DefaultParagraphFont"/>
     <w:link w:val="Heading1"/>
     <w:uiPriority w:val="9"/>
-    <w:rsid w:val="00D57911"/>
+    <w:rsid w:val="00F908BF"/>
     <w:rPr>
       <w:rFonts w:asciiTheme="majorHAnsi" w:eastAsiaTheme="majorEastAsia" w:hAnsiTheme="majorHAnsi" w:cstheme="majorBidi"/>
       <w:color w:val="0F4761" w:themeColor="accent1" w:themeShade="BF"/>
@@ -1850,7 +1885,7 @@
     <w:link w:val="Heading2"/>
     <w:uiPriority w:val="9"/>
     <w:semiHidden/>
-    <w:rsid w:val="00D57911"/>
+    <w:rsid w:val="00F908BF"/>
     <w:rPr>
       <w:rFonts w:asciiTheme="majorHAnsi" w:eastAsiaTheme="majorEastAsia" w:hAnsiTheme="majorHAnsi" w:cstheme="majorBidi"/>
       <w:color w:val="0F4761" w:themeColor="accent1" w:themeShade="BF"/>
@@ -1864,7 +1899,7 @@
     <w:link w:val="Heading3"/>
     <w:uiPriority w:val="9"/>
     <w:semiHidden/>
-    <w:rsid w:val="00D57911"/>
+    <w:rsid w:val="00F908BF"/>
     <w:rPr>
       <w:rFonts w:eastAsiaTheme="majorEastAsia" w:cstheme="majorBidi"/>
       <w:color w:val="0F4761" w:themeColor="accent1" w:themeShade="BF"/>
@@ -1878,7 +1913,7 @@
     <w:link w:val="Heading4"/>
     <w:uiPriority w:val="9"/>
     <w:semiHidden/>
-    <w:rsid w:val="00D57911"/>
+    <w:rsid w:val="00F908BF"/>
     <w:rPr>
       <w:rFonts w:eastAsiaTheme="majorEastAsia" w:cstheme="majorBidi"/>
       <w:i/>
@@ -1892,7 +1927,7 @@
     <w:link w:val="Heading5"/>
     <w:uiPriority w:val="9"/>
     <w:semiHidden/>
-    <w:rsid w:val="00D57911"/>
+    <w:rsid w:val="00F908BF"/>
     <w:rPr>
       <w:rFonts w:eastAsiaTheme="majorEastAsia" w:cstheme="majorBidi"/>
       <w:color w:val="0F4761" w:themeColor="accent1" w:themeShade="BF"/>
@@ -1904,7 +1939,7 @@
     <w:link w:val="Heading6"/>
     <w:uiPriority w:val="9"/>
     <w:semiHidden/>
-    <w:rsid w:val="00D57911"/>
+    <w:rsid w:val="00F908BF"/>
     <w:rPr>
       <w:rFonts w:eastAsiaTheme="majorEastAsia" w:cstheme="majorBidi"/>
       <w:i/>
@@ -1918,7 +1953,7 @@
     <w:link w:val="Heading7"/>
     <w:uiPriority w:val="9"/>
     <w:semiHidden/>
-    <w:rsid w:val="00D57911"/>
+    <w:rsid w:val="00F908BF"/>
     <w:rPr>
       <w:rFonts w:eastAsiaTheme="majorEastAsia" w:cstheme="majorBidi"/>
       <w:color w:val="595959" w:themeColor="text1" w:themeTint="A6"/>
@@ -1930,7 +1965,7 @@
     <w:link w:val="Heading8"/>
     <w:uiPriority w:val="9"/>
     <w:semiHidden/>
-    <w:rsid w:val="00D57911"/>
+    <w:rsid w:val="00F908BF"/>
     <w:rPr>
       <w:rFonts w:eastAsiaTheme="majorEastAsia" w:cstheme="majorBidi"/>
       <w:i/>
@@ -1944,7 +1979,7 @@
     <w:link w:val="Heading9"/>
     <w:uiPriority w:val="9"/>
     <w:semiHidden/>
-    <w:rsid w:val="00D57911"/>
+    <w:rsid w:val="00F908BF"/>
     <w:rPr>
       <w:rFonts w:eastAsiaTheme="majorEastAsia" w:cstheme="majorBidi"/>
       <w:color w:val="272727" w:themeColor="text1" w:themeTint="D8"/>
@@ -1957,7 +1992,7 @@
     <w:link w:val="TitleChar"/>
     <w:uiPriority w:val="10"/>
     <w:qFormat/>
-    <w:rsid w:val="00D57911"/>
+    <w:rsid w:val="00F908BF"/>
     <w:pPr>
       <w:spacing w:after="80" w:line="240" w:lineRule="auto"/>
       <w:contextualSpacing/>
@@ -1975,7 +2010,7 @@
     <w:basedOn w:val="DefaultParagraphFont"/>
     <w:link w:val="Title"/>
     <w:uiPriority w:val="10"/>
-    <w:rsid w:val="00D57911"/>
+    <w:rsid w:val="00F908BF"/>
     <w:rPr>
       <w:rFonts w:asciiTheme="majorHAnsi" w:eastAsiaTheme="majorEastAsia" w:hAnsiTheme="majorHAnsi" w:cstheme="majorBidi"/>
       <w:spacing w:val="-10"/>
@@ -1991,7 +2026,7 @@
     <w:link w:val="SubtitleChar"/>
     <w:uiPriority w:val="11"/>
     <w:qFormat/>
-    <w:rsid w:val="00D57911"/>
+    <w:rsid w:val="00F908BF"/>
     <w:pPr>
       <w:numPr>
         <w:ilvl w:val="1"/>
@@ -2010,7 +2045,7 @@
     <w:basedOn w:val="DefaultParagraphFont"/>
     <w:link w:val="Subtitle"/>
     <w:uiPriority w:val="11"/>
-    <w:rsid w:val="00D57911"/>
+    <w:rsid w:val="00F908BF"/>
     <w:rPr>
       <w:rFonts w:eastAsiaTheme="majorEastAsia" w:cstheme="majorBidi"/>
       <w:color w:val="595959" w:themeColor="text1" w:themeTint="A6"/>
@@ -2026,7 +2061,7 @@
     <w:link w:val="QuoteChar"/>
     <w:uiPriority w:val="29"/>
     <w:qFormat/>
-    <w:rsid w:val="00D57911"/>
+    <w:rsid w:val="00F908BF"/>
     <w:pPr>
       <w:spacing w:before="160"/>
       <w:jc w:val="center"/>
@@ -2042,7 +2077,7 @@
     <w:basedOn w:val="DefaultParagraphFont"/>
     <w:link w:val="Quote"/>
     <w:uiPriority w:val="29"/>
-    <w:rsid w:val="00D57911"/>
+    <w:rsid w:val="00F908BF"/>
     <w:rPr>
       <w:i/>
       <w:iCs/>
@@ -2054,7 +2089,7 @@
     <w:basedOn w:val="Normal"/>
     <w:uiPriority w:val="34"/>
     <w:qFormat/>
-    <w:rsid w:val="00D57911"/>
+    <w:rsid w:val="00F908BF"/>
     <w:pPr>
       <w:ind w:left="720"/>
       <w:contextualSpacing/>
@@ -2065,7 +2100,7 @@
     <w:basedOn w:val="DefaultParagraphFont"/>
     <w:uiPriority w:val="21"/>
     <w:qFormat/>
-    <w:rsid w:val="00D57911"/>
+    <w:rsid w:val="00F908BF"/>
     <w:rPr>
       <w:i/>
       <w:iCs/>
@@ -2079,7 +2114,7 @@
     <w:link w:val="IntenseQuoteChar"/>
     <w:uiPriority w:val="30"/>
     <w:qFormat/>
-    <w:rsid w:val="00D57911"/>
+    <w:rsid w:val="00F908BF"/>
     <w:pPr>
       <w:pBdr>
         <w:top w:val="single" w:sz="4" w:space="10" w:color="0F4761" w:themeColor="accent1" w:themeShade="BF"/>
@@ -2100,7 +2135,7 @@
     <w:basedOn w:val="DefaultParagraphFont"/>
     <w:link w:val="IntenseQuote"/>
     <w:uiPriority w:val="30"/>
-    <w:rsid w:val="00D57911"/>
+    <w:rsid w:val="00F908BF"/>
     <w:rPr>
       <w:i/>
       <w:iCs/>
@@ -2112,7 +2147,7 @@
     <w:basedOn w:val="DefaultParagraphFont"/>
     <w:uiPriority w:val="32"/>
     <w:qFormat/>
-    <w:rsid w:val="00D57911"/>
+    <w:rsid w:val="00F908BF"/>
     <w:rPr>
       <w:b/>
       <w:bCs/>
@@ -2127,7 +2162,7 @@
     <w:link w:val="HeaderChar"/>
     <w:uiPriority w:val="99"/>
     <w:unhideWhenUsed/>
-    <w:rsid w:val="00D57911"/>
+    <w:rsid w:val="00F908BF"/>
     <w:pPr>
       <w:tabs>
         <w:tab w:val="center" w:pos="4680"/>
@@ -2141,7 +2176,7 @@
     <w:basedOn w:val="DefaultParagraphFont"/>
     <w:link w:val="Header"/>
     <w:uiPriority w:val="99"/>
-    <w:rsid w:val="00D57911"/>
+    <w:rsid w:val="00F908BF"/>
   </w:style>
   <w:style w:type="paragraph" w:styleId="Footer">
     <w:name w:val="footer"/>
@@ -2149,7 +2184,7 @@
     <w:link w:val="FooterChar"/>
     <w:uiPriority w:val="99"/>
     <w:unhideWhenUsed/>
-    <w:rsid w:val="00D57911"/>
+    <w:rsid w:val="00F908BF"/>
     <w:pPr>
       <w:tabs>
         <w:tab w:val="center" w:pos="4680"/>
@@ -2163,7 +2198,7 @@
     <w:basedOn w:val="DefaultParagraphFont"/>
     <w:link w:val="Footer"/>
     <w:uiPriority w:val="99"/>
-    <w:rsid w:val="00D57911"/>
+    <w:rsid w:val="00F908BF"/>
   </w:style>
 </w:styles>
 </file>

</xml_diff>

<commit_message>
docs(bd): expand company dossiers to full intel (per Ian: all info, not 1-pagers)
Company dossiers now hold ALL gathered info (2pp each): full First Nations +
public client list, representative projects, KOR/Deltek finding, shared-client
overlap, named live teaming triggers, talking points, and a sources/methodology
section. Islander gains a two-firm-cluster strategic note. Exec combo brief
stays 1 page. Verified by rendering Gwaii dossier to PDF.

Co-Authored-By: Claude Opus 4.8 <noreply@anthropic.com>
</commit_message>
<xml_diff>
--- a/docs/KOR-Gwaii-Engineering-Dossier-2026-06-23.docx
+++ b/docs/KOR-Gwaii-Engineering-Dossier-2026-06-23.docx
@@ -219,12 +219,6 @@
         <w:gridCol w:w="3200"/>
       </w:tblGrid>
       <w:tr>
-        <w:tblPrEx>
-          <w:tblCellMar>
-            <w:top w:w="0" w:type="dxa"/>
-            <w:bottom w:w="0" w:type="dxa"/>
-          </w:tblCellMar>
-        </w:tblPrEx>
         <w:tc>
           <w:tcPr>
             <w:tcW w:w="2400" w:type="dxa"/>
@@ -320,12 +314,6 @@
         </w:tc>
       </w:tr>
       <w:tr>
-        <w:tblPrEx>
-          <w:tblCellMar>
-            <w:top w:w="0" w:type="dxa"/>
-            <w:bottom w:w="0" w:type="dxa"/>
-          </w:tblCellMar>
-        </w:tblPrEx>
         <w:tc>
           <w:tcPr>
             <w:tcW w:w="2400" w:type="dxa"/>
@@ -412,12 +400,6 @@
         </w:tc>
       </w:tr>
       <w:tr>
-        <w:tblPrEx>
-          <w:tblCellMar>
-            <w:top w:w="0" w:type="dxa"/>
-            <w:bottom w:w="0" w:type="dxa"/>
-          </w:tblCellMar>
-        </w:tblPrEx>
         <w:tc>
           <w:tcPr>
             <w:tcW w:w="2400" w:type="dxa"/>
@@ -507,12 +489,6 @@
         </w:tc>
       </w:tr>
       <w:tr>
-        <w:tblPrEx>
-          <w:tblCellMar>
-            <w:top w:w="0" w:type="dxa"/>
-            <w:bottom w:w="0" w:type="dxa"/>
-          </w:tblCellMar>
-        </w:tblPrEx>
         <w:tc>
           <w:tcPr>
             <w:tcW w:w="2400" w:type="dxa"/>
@@ -599,12 +575,6 @@
         </w:tc>
       </w:tr>
       <w:tr>
-        <w:tblPrEx>
-          <w:tblCellMar>
-            <w:top w:w="0" w:type="dxa"/>
-            <w:bottom w:w="0" w:type="dxa"/>
-          </w:tblCellMar>
-        </w:tblPrEx>
         <w:tc>
           <w:tcPr>
             <w:tcW w:w="2400" w:type="dxa"/>
@@ -694,12 +664,6 @@
         </w:tc>
       </w:tr>
       <w:tr>
-        <w:tblPrEx>
-          <w:tblCellMar>
-            <w:top w:w="0" w:type="dxa"/>
-            <w:bottom w:w="0" w:type="dxa"/>
-          </w:tblCellMar>
-        </w:tblPrEx>
         <w:tc>
           <w:tcPr>
             <w:tcW w:w="2400" w:type="dxa"/>
@@ -807,7 +771,7 @@
           <w:b/>
           <w:color w:val="002060"/>
         </w:rPr>
-        <w:t>Portfolio &amp; client base</w:t>
+        <w:t>First Nations &amp; public clients (incumbent civil engineer)</w:t>
       </w:r>
     </w:p>
     <w:p>
@@ -825,25 +789,7 @@
           <w:color w:val="000000"/>
           <w:sz w:val="21"/>
         </w:rPr>
-        <w:t>Incumbent civil engineer to 25+ First Nations across coastal BC and Vancouver Island - Tla'amin, Ucluelet, Malahat, Cowichan Tribes, Ditidaht, Haida Nation, Kitasoo, K'omoks, Tsawout, Tsawwassen, Songhees, Esquimalt - plus BC Housing. Representative projects: Yuu-thlu-ilth-aht (Ucluelet) Government Lift Station, Tsawout First Nation Big House, Malahat Nation Marina &amp; Boat Launch, Reay Creek Remediation, and 'Our House of Clans' (BC Housing &amp; Tsain-Ko).</w:t>
-      </w:r>
-    </w:p>
-    <w:p>
-      <w:pPr>
-        <w:spacing w:after="60"/>
-        <w:rPr>
-          <w:rFonts w:ascii="Calibri" w:hAnsi="Calibri" w:cs="Calibri"/>
-          <w:b/>
-          <w:color w:val="002060"/>
-        </w:rPr>
-      </w:pPr>
-      <w:r>
-        <w:rPr>
-          <w:rFonts w:ascii="Calibri" w:hAnsi="Calibri" w:cs="Calibri"/>
-          <w:b/>
-          <w:color w:val="002060"/>
-        </w:rPr>
-        <w:t>KOR relationship &amp; relationships in common</w:t>
+        <w:t>Gwaii is the incumbent civil engineer for 25+ First Nations across coastal BC &amp; Vancouver Island, plus BC Housing and local governments. Named on their site / in KOR's graph:</w:t>
       </w:r>
     </w:p>
     <w:p>
@@ -871,7 +817,7 @@
           <w:color w:val="000000"/>
           <w:sz w:val="20"/>
         </w:rPr>
-        <w:t>No prior KOR contractual history - not in Deltek as a client or vendor; no Gwaii contact on file. This is a NET-NEW teaming relationship, not a renewal.</w:t>
+        <w:t>First Nations: Tla'amin, Ucluelet, Malahat Nation, Cowichan Tribes, Ditidaht, Haida Nation, Kitasoo, K'omoks, Tsawout, Tsawwassen, Songhees, Esquimalt, plus Old Masset Village Council (founder's home community).</w:t>
       </w:r>
     </w:p>
     <w:p>
@@ -899,7 +845,25 @@
           <w:color w:val="000000"/>
           <w:sz w:val="20"/>
         </w:rPr>
-        <w:t>Sibling firm to Islander Engineering: founder Corey Brown co-founded Islander (2016) then Gwaii (2017); the firms share senior staff (Mike Achtem, Jared Smylie appear at both).</w:t>
+        <w:t>Public / housing: BC Housing (KOR tracks 50 projects with BC Housing as owner), Tsain-Ko Group of Companies, and Vancouver Island regional districts / school districts (SD50 Haida Gwaii, SD71 Comox, SD79 Cowichan).</w:t>
+      </w:r>
+    </w:p>
+    <w:p>
+      <w:pPr>
+        <w:spacing w:after="60"/>
+        <w:rPr>
+          <w:rFonts w:ascii="Calibri" w:hAnsi="Calibri" w:cs="Calibri"/>
+          <w:b/>
+          <w:color w:val="002060"/>
+        </w:rPr>
+      </w:pPr>
+      <w:r>
+        <w:rPr>
+          <w:rFonts w:ascii="Calibri" w:hAnsi="Calibri" w:cs="Calibri"/>
+          <w:b/>
+          <w:color w:val="002060"/>
+        </w:rPr>
+        <w:t>Representative projects</w:t>
       </w:r>
     </w:p>
     <w:p>
@@ -927,7 +891,7 @@
           <w:color w:val="000000"/>
           <w:sz w:val="20"/>
         </w:rPr>
-        <w:t xml:space="preserve">Heavy overlap with KOR's own pursuit list: KOR already tracks nearly all of Gwaii's clients as open Buyer/Developer targets - </w:t>
+        <w:t>Yuu-thlu-ilth-aht (Ucluelet) Government - lift station upgrades.</w:t>
       </w:r>
     </w:p>
     <w:p>
@@ -955,25 +919,7 @@
           <w:color w:val="000000"/>
           <w:sz w:val="20"/>
         </w:rPr>
-        <w:t>BC Housing (KOR tracks 50 projects as owner), Cowichan Tribes, Malahat Nation, Tsawout, Tsawwassen, Songhees, Esquimalt, Ditidaht, Ucluelet First Nation, Haida Nation, Tla'amin, Tsain-Ko, Comox Valley / Strathcona, and School Districts 50 (Haida Gwaii), 71 (Comox) and 79 (Cowichan) - all currently in KOR's pursuit graph with zero KOR projects won (open targets).</w:t>
-      </w:r>
-    </w:p>
-    <w:p>
-      <w:pPr>
-        <w:spacing w:after="60"/>
-        <w:rPr>
-          <w:rFonts w:ascii="Calibri" w:hAnsi="Calibri" w:cs="Calibri"/>
-          <w:b/>
-          <w:color w:val="002060"/>
-        </w:rPr>
-      </w:pPr>
-      <w:r>
-        <w:rPr>
-          <w:rFonts w:ascii="Calibri" w:hAnsi="Calibri" w:cs="Calibri"/>
-          <w:b/>
-          <w:color w:val="002060"/>
-        </w:rPr>
-        <w:t>Talking points for Rory</w:t>
+        <w:t>Tsawout First Nation - Big House.</w:t>
       </w:r>
     </w:p>
     <w:p>
@@ -1001,7 +947,7 @@
           <w:color w:val="000000"/>
           <w:sz w:val="20"/>
         </w:rPr>
-        <w:t>Lead with complement, not competition: KOR is structural, Gwaii is civil/environmental - the disciplines pair on the same teams and never bid against each other.</w:t>
+        <w:t>Malahat Nation - Marina &amp; Boat Launch.</w:t>
       </w:r>
     </w:p>
     <w:p>
@@ -1029,7 +975,7 @@
           <w:color w:val="000000"/>
           <w:sz w:val="20"/>
         </w:rPr>
-        <w:t>Indigenous-participation angle: a KOR structural + Gwaii civil team earns CCAB / Indigenous-participation scoring on public RFQs, where Gwaii is already the incumbent civil engineer and KOR supplies structural depth Gwaii does not hold in-house.</w:t>
+        <w:t>Reay Creek Remediation Project.</w:t>
       </w:r>
     </w:p>
     <w:p>
@@ -1057,7 +1003,7 @@
           <w:color w:val="000000"/>
           <w:sz w:val="20"/>
         </w:rPr>
-        <w:t>Concrete opener to Corey Brown (cbrown@gwaiieng.com) or Brandon Ducharme (Capital Advisory): 'KOR has a coastal-BC / Vancouver Island structural portfolio and wants to support Indigenous-led infrastructure - which of your upcoming Nation or BC Housing projects need a structural partner?'</w:t>
+        <w:t>'Our House of Clans' - BC Housing &amp; Tsain-Ko.</w:t>
       </w:r>
     </w:p>
     <w:p>
@@ -1085,16 +1031,461 @@
           <w:color w:val="000000"/>
           <w:sz w:val="20"/>
         </w:rPr>
-        <w:t>LIVE TRIGGERS - lead with a named project KOR is already pursuing on Gwaii-client land: Duncan 'River's Edge' (Cowichan Tribes + BC Housing), Saanichton (Tsawout First Nation, 7593 Tetayut Rd), the Vancouver Island BC Housing pursuits (Nanaimo, Saanich, Campbell River), or Penticton Skaha Assembly Redevelopment (PURSUE_URGENT). Ask whether Gwaii is already engaged and wants a structural partner.</w:t>
+        <w:t>Water / wastewater systems, community energy retrofits, and grant-funded infrastructure for multiple Nations.</w:t>
+      </w:r>
+    </w:p>
+    <w:p>
+      <w:pPr>
+        <w:spacing w:after="60"/>
+        <w:rPr>
+          <w:rFonts w:ascii="Calibri" w:hAnsi="Calibri" w:cs="Calibri"/>
+          <w:b/>
+          <w:color w:val="002060"/>
+        </w:rPr>
+      </w:pPr>
+      <w:r>
+        <w:rPr>
+          <w:rFonts w:ascii="Calibri" w:hAnsi="Calibri" w:cs="Calibri"/>
+          <w:b/>
+          <w:color w:val="002060"/>
+        </w:rPr>
+        <w:t>KOR relationship &amp; relationships in common</w:t>
       </w:r>
     </w:p>
     <w:p>
       <w:pPr>
         <w:spacing w:after="80"/>
-        <w:rPr>
-          <w:rFonts w:ascii="Calibri" w:hAnsi="Calibri" w:cs="Calibri"/>
-          <w:color w:val="000000"/>
-          <w:sz w:val="20"/>
+        <w:ind w:left="280" w:hanging="280"/>
+        <w:rPr>
+          <w:rFonts w:ascii="Calibri" w:hAnsi="Calibri" w:cs="Calibri"/>
+          <w:color w:val="000000"/>
+          <w:sz w:val="20"/>
+        </w:rPr>
+      </w:pPr>
+      <w:r>
+        <w:rPr>
+          <w:rFonts w:ascii="Calibri" w:hAnsi="Calibri" w:cs="Calibri"/>
+          <w:b/>
+          <w:color w:val="002060"/>
+          <w:sz w:val="20"/>
+        </w:rPr>
+        <w:t xml:space="preserve">•  </w:t>
+      </w:r>
+      <w:r>
+        <w:rPr>
+          <w:rFonts w:ascii="Calibri" w:hAnsi="Calibri" w:cs="Calibri"/>
+          <w:color w:val="000000"/>
+          <w:sz w:val="20"/>
+        </w:rPr>
+        <w:t>No prior KOR contractual history - confirmed absent from Deltek (not a client or vendor; no Gwaii contact on file). This is NET-NEW white space, not a renewal.</w:t>
+      </w:r>
+    </w:p>
+    <w:p>
+      <w:pPr>
+        <w:spacing w:after="80"/>
+        <w:ind w:left="280" w:hanging="280"/>
+        <w:rPr>
+          <w:rFonts w:ascii="Calibri" w:hAnsi="Calibri" w:cs="Calibri"/>
+          <w:color w:val="000000"/>
+          <w:sz w:val="20"/>
+        </w:rPr>
+      </w:pPr>
+      <w:r>
+        <w:rPr>
+          <w:rFonts w:ascii="Calibri" w:hAnsi="Calibri" w:cs="Calibri"/>
+          <w:b/>
+          <w:color w:val="002060"/>
+          <w:sz w:val="20"/>
+        </w:rPr>
+        <w:t xml:space="preserve">•  </w:t>
+      </w:r>
+      <w:r>
+        <w:rPr>
+          <w:rFonts w:ascii="Calibri" w:hAnsi="Calibri" w:cs="Calibri"/>
+          <w:color w:val="000000"/>
+          <w:sz w:val="20"/>
+        </w:rPr>
+        <w:t>Sibling firm to Islander Engineering: founder Corey Brown co-founded Islander (2016) then Gwaii (2017); the firms share senior staff - Mike Achtem (Principal) and Jared Smylie appear at both.</w:t>
+      </w:r>
+    </w:p>
+    <w:p>
+      <w:pPr>
+        <w:spacing w:after="80"/>
+        <w:ind w:left="280" w:hanging="280"/>
+        <w:rPr>
+          <w:rFonts w:ascii="Calibri" w:hAnsi="Calibri" w:cs="Calibri"/>
+          <w:color w:val="000000"/>
+          <w:sz w:val="20"/>
+        </w:rPr>
+      </w:pPr>
+      <w:r>
+        <w:rPr>
+          <w:rFonts w:ascii="Calibri" w:hAnsi="Calibri" w:cs="Calibri"/>
+          <w:b/>
+          <w:color w:val="002060"/>
+          <w:sz w:val="20"/>
+        </w:rPr>
+        <w:lastRenderedPageBreak/>
+        <w:t xml:space="preserve">•  </w:t>
+      </w:r>
+      <w:r>
+        <w:rPr>
+          <w:rFonts w:ascii="Calibri" w:hAnsi="Calibri" w:cs="Calibri"/>
+          <w:color w:val="000000"/>
+          <w:sz w:val="20"/>
+        </w:rPr>
+        <w:t xml:space="preserve">Heavy overlap with KOR's own pursuit list: KOR already tracks nearly all of Gwaii's clients as open Buyer/Developer targets - </w:t>
+      </w:r>
+    </w:p>
+    <w:p>
+      <w:pPr>
+        <w:spacing w:after="80"/>
+        <w:ind w:left="280" w:hanging="280"/>
+        <w:rPr>
+          <w:rFonts w:ascii="Calibri" w:hAnsi="Calibri" w:cs="Calibri"/>
+          <w:color w:val="000000"/>
+          <w:sz w:val="20"/>
+        </w:rPr>
+      </w:pPr>
+      <w:r>
+        <w:rPr>
+          <w:rFonts w:ascii="Calibri" w:hAnsi="Calibri" w:cs="Calibri"/>
+          <w:b/>
+          <w:color w:val="002060"/>
+          <w:sz w:val="20"/>
+        </w:rPr>
+        <w:t xml:space="preserve">•  </w:t>
+      </w:r>
+      <w:r>
+        <w:rPr>
+          <w:rFonts w:ascii="Calibri" w:hAnsi="Calibri" w:cs="Calibri"/>
+          <w:color w:val="000000"/>
+          <w:sz w:val="20"/>
+        </w:rPr>
+        <w:t>BC Housing (KOR tracks 50 projects as owner), Cowichan Tribes, Malahat Nation, Tsawout, Tsawwassen, Songhees, Esquimalt, Ditidaht, Ucluelet First Nation, Haida Nation, Tla'amin, Tsain-Ko, Comox Valley / Strathcona, and School Districts 50 (Haida Gwaii), 71 (Comox) and 79 (Cowichan) - all currently in KOR's pursuit graph with zero KOR projects won (open targets).</w:t>
+      </w:r>
+    </w:p>
+    <w:p>
+      <w:pPr>
+        <w:spacing w:after="60"/>
+        <w:rPr>
+          <w:rFonts w:ascii="Calibri" w:hAnsi="Calibri" w:cs="Calibri"/>
+          <w:b/>
+          <w:color w:val="002060"/>
+        </w:rPr>
+      </w:pPr>
+      <w:r>
+        <w:rPr>
+          <w:rFonts w:ascii="Calibri" w:hAnsi="Calibri" w:cs="Calibri"/>
+          <w:b/>
+          <w:color w:val="002060"/>
+        </w:rPr>
+        <w:t>Live teaming triggers (KOR pursuits on Gwaii-client land)</w:t>
+      </w:r>
+    </w:p>
+    <w:p>
+      <w:pPr>
+        <w:spacing w:after="100"/>
+        <w:rPr>
+          <w:rFonts w:ascii="Calibri" w:hAnsi="Calibri" w:cs="Calibri"/>
+          <w:color w:val="000000"/>
+          <w:sz w:val="21"/>
+        </w:rPr>
+      </w:pPr>
+      <w:r>
+        <w:rPr>
+          <w:rFonts w:ascii="Calibri" w:hAnsi="Calibri" w:cs="Calibri"/>
+          <w:color w:val="000000"/>
+          <w:sz w:val="21"/>
+        </w:rPr>
+        <w:t>KOR is ALREADY pursuing projects whose owners are Gwaii's incumbent clients - these are the immediate, named teaming triggers:</w:t>
+      </w:r>
+    </w:p>
+    <w:p>
+      <w:pPr>
+        <w:spacing w:after="80"/>
+        <w:ind w:left="280" w:hanging="280"/>
+        <w:rPr>
+          <w:rFonts w:ascii="Calibri" w:hAnsi="Calibri" w:cs="Calibri"/>
+          <w:color w:val="000000"/>
+          <w:sz w:val="20"/>
+        </w:rPr>
+      </w:pPr>
+      <w:r>
+        <w:rPr>
+          <w:rFonts w:ascii="Calibri" w:hAnsi="Calibri" w:cs="Calibri"/>
+          <w:b/>
+          <w:color w:val="002060"/>
+          <w:sz w:val="20"/>
+        </w:rPr>
+        <w:t xml:space="preserve">•  </w:t>
+      </w:r>
+      <w:r>
+        <w:rPr>
+          <w:rFonts w:ascii="Calibri" w:hAnsi="Calibri" w:cs="Calibri"/>
+          <w:color w:val="000000"/>
+          <w:sz w:val="20"/>
+        </w:rPr>
+        <w:t>Duncan 'River's Edge' - Cowichan Tribes + BC Housing (Cowichan is a Gwaii client).</w:t>
+      </w:r>
+    </w:p>
+    <w:p>
+      <w:pPr>
+        <w:spacing w:after="80"/>
+        <w:ind w:left="280" w:hanging="280"/>
+        <w:rPr>
+          <w:rFonts w:ascii="Calibri" w:hAnsi="Calibri" w:cs="Calibri"/>
+          <w:color w:val="000000"/>
+          <w:sz w:val="20"/>
+        </w:rPr>
+      </w:pPr>
+      <w:r>
+        <w:rPr>
+          <w:rFonts w:ascii="Calibri" w:hAnsi="Calibri" w:cs="Calibri"/>
+          <w:b/>
+          <w:color w:val="002060"/>
+          <w:sz w:val="20"/>
+        </w:rPr>
+        <w:t xml:space="preserve">•  </w:t>
+      </w:r>
+      <w:r>
+        <w:rPr>
+          <w:rFonts w:ascii="Calibri" w:hAnsi="Calibri" w:cs="Calibri"/>
+          <w:color w:val="000000"/>
+          <w:sz w:val="20"/>
+        </w:rPr>
+        <w:t>Saanichton - Tsawout First Nation, 7593 Tetayut Rd (Tsawout is a Gwaii client).</w:t>
+      </w:r>
+    </w:p>
+    <w:p>
+      <w:pPr>
+        <w:spacing w:after="80"/>
+        <w:ind w:left="280" w:hanging="280"/>
+        <w:rPr>
+          <w:rFonts w:ascii="Calibri" w:hAnsi="Calibri" w:cs="Calibri"/>
+          <w:color w:val="000000"/>
+          <w:sz w:val="20"/>
+        </w:rPr>
+      </w:pPr>
+      <w:r>
+        <w:rPr>
+          <w:rFonts w:ascii="Calibri" w:hAnsi="Calibri" w:cs="Calibri"/>
+          <w:b/>
+          <w:color w:val="002060"/>
+          <w:sz w:val="20"/>
+        </w:rPr>
+        <w:t xml:space="preserve">•  </w:t>
+      </w:r>
+      <w:r>
+        <w:rPr>
+          <w:rFonts w:ascii="Calibri" w:hAnsi="Calibri" w:cs="Calibri"/>
+          <w:color w:val="000000"/>
+          <w:sz w:val="20"/>
+        </w:rPr>
+        <w:t>Penticton - Skaha Assembly Redevelopment (PURSUE_URGENT; Indigenous / BC Housing lane).</w:t>
+      </w:r>
+    </w:p>
+    <w:p>
+      <w:pPr>
+        <w:spacing w:after="80"/>
+        <w:ind w:left="280" w:hanging="280"/>
+        <w:rPr>
+          <w:rFonts w:ascii="Calibri" w:hAnsi="Calibri" w:cs="Calibri"/>
+          <w:color w:val="000000"/>
+          <w:sz w:val="20"/>
+        </w:rPr>
+      </w:pPr>
+      <w:r>
+        <w:rPr>
+          <w:rFonts w:ascii="Calibri" w:hAnsi="Calibri" w:cs="Calibri"/>
+          <w:b/>
+          <w:color w:val="002060"/>
+          <w:sz w:val="20"/>
+        </w:rPr>
+        <w:t xml:space="preserve">•  </w:t>
+      </w:r>
+      <w:r>
+        <w:rPr>
+          <w:rFonts w:ascii="Calibri" w:hAnsi="Calibri" w:cs="Calibri"/>
+          <w:color w:val="000000"/>
+          <w:sz w:val="20"/>
+        </w:rPr>
+        <w:t>Vancouver Island BC Housing wave - Nanaimo (250 Terminal Ave, Fifth Street, 1030 Old Victoria Rd), Saanich (3690 Richmond Rd), Campbell River (Robron Village) - Gwaii's home geography.</w:t>
+      </w:r>
+    </w:p>
+    <w:p>
+      <w:pPr>
+        <w:spacing w:after="60"/>
+        <w:rPr>
+          <w:rFonts w:ascii="Calibri" w:hAnsi="Calibri" w:cs="Calibri"/>
+          <w:b/>
+          <w:color w:val="002060"/>
+        </w:rPr>
+      </w:pPr>
+      <w:r>
+        <w:rPr>
+          <w:rFonts w:ascii="Calibri" w:hAnsi="Calibri" w:cs="Calibri"/>
+          <w:b/>
+          <w:color w:val="002060"/>
+        </w:rPr>
+        <w:t>Talking points for Rory</w:t>
+      </w:r>
+    </w:p>
+    <w:p>
+      <w:pPr>
+        <w:spacing w:after="80"/>
+        <w:ind w:left="280" w:hanging="280"/>
+        <w:rPr>
+          <w:rFonts w:ascii="Calibri" w:hAnsi="Calibri" w:cs="Calibri"/>
+          <w:color w:val="000000"/>
+          <w:sz w:val="20"/>
+        </w:rPr>
+      </w:pPr>
+      <w:r>
+        <w:rPr>
+          <w:rFonts w:ascii="Calibri" w:hAnsi="Calibri" w:cs="Calibri"/>
+          <w:b/>
+          <w:color w:val="002060"/>
+          <w:sz w:val="20"/>
+        </w:rPr>
+        <w:t xml:space="preserve">•  </w:t>
+      </w:r>
+      <w:r>
+        <w:rPr>
+          <w:rFonts w:ascii="Calibri" w:hAnsi="Calibri" w:cs="Calibri"/>
+          <w:color w:val="000000"/>
+          <w:sz w:val="20"/>
+        </w:rPr>
+        <w:t>Lead with complement, not competition: KOR is structural, Gwaii is civil/environmental - the disciplines pair on the same teams and never bid against each other.</w:t>
+      </w:r>
+    </w:p>
+    <w:p>
+      <w:pPr>
+        <w:spacing w:after="80"/>
+        <w:ind w:left="280" w:hanging="280"/>
+        <w:rPr>
+          <w:rFonts w:ascii="Calibri" w:hAnsi="Calibri" w:cs="Calibri"/>
+          <w:color w:val="000000"/>
+          <w:sz w:val="20"/>
+        </w:rPr>
+      </w:pPr>
+      <w:r>
+        <w:rPr>
+          <w:rFonts w:ascii="Calibri" w:hAnsi="Calibri" w:cs="Calibri"/>
+          <w:b/>
+          <w:color w:val="002060"/>
+          <w:sz w:val="20"/>
+        </w:rPr>
+        <w:t xml:space="preserve">•  </w:t>
+      </w:r>
+      <w:r>
+        <w:rPr>
+          <w:rFonts w:ascii="Calibri" w:hAnsi="Calibri" w:cs="Calibri"/>
+          <w:color w:val="000000"/>
+          <w:sz w:val="20"/>
+        </w:rPr>
+        <w:t>Indigenous-participation angle: a KOR structural + Gwaii civil team earns CCAB / Indigenous-participation scoring on public RFQs, where Gwaii is already the incumbent civil engineer and KOR supplies structural depth Gwaii does not hold in-house.</w:t>
+      </w:r>
+    </w:p>
+    <w:p>
+      <w:pPr>
+        <w:spacing w:after="80"/>
+        <w:ind w:left="280" w:hanging="280"/>
+        <w:rPr>
+          <w:rFonts w:ascii="Calibri" w:hAnsi="Calibri" w:cs="Calibri"/>
+          <w:color w:val="000000"/>
+          <w:sz w:val="20"/>
+        </w:rPr>
+      </w:pPr>
+      <w:r>
+        <w:rPr>
+          <w:rFonts w:ascii="Calibri" w:hAnsi="Calibri" w:cs="Calibri"/>
+          <w:b/>
+          <w:color w:val="002060"/>
+          <w:sz w:val="20"/>
+        </w:rPr>
+        <w:t xml:space="preserve">•  </w:t>
+      </w:r>
+      <w:r>
+        <w:rPr>
+          <w:rFonts w:ascii="Calibri" w:hAnsi="Calibri" w:cs="Calibri"/>
+          <w:color w:val="000000"/>
+          <w:sz w:val="20"/>
+        </w:rPr>
+        <w:t>Open to Corey Brown (cbrown@gwaiieng.com) or Brandon Ducharme (Capital Advisory, bducharme@gwaiieng.com) by NAMING a live trigger above (Duncan River's Edge or the Tsawout project): 'KOR has a coastal-BC / Vancouver Island structural portfolio and wants to support Indigenous-led infrastructure - is Gwaii engaged on this, and do you want a structural partner?'</w:t>
+      </w:r>
+    </w:p>
+    <w:p>
+      <w:pPr>
+        <w:spacing w:after="80"/>
+        <w:ind w:left="280" w:hanging="280"/>
+        <w:rPr>
+          <w:rFonts w:ascii="Calibri" w:hAnsi="Calibri" w:cs="Calibri"/>
+          <w:color w:val="000000"/>
+          <w:sz w:val="20"/>
+        </w:rPr>
+      </w:pPr>
+      <w:r>
+        <w:rPr>
+          <w:rFonts w:ascii="Calibri" w:hAnsi="Calibri" w:cs="Calibri"/>
+          <w:b/>
+          <w:color w:val="002060"/>
+          <w:sz w:val="20"/>
+        </w:rPr>
+        <w:t xml:space="preserve">•  </w:t>
+      </w:r>
+      <w:r>
+        <w:rPr>
+          <w:rFonts w:ascii="Calibri" w:hAnsi="Calibri" w:cs="Calibri"/>
+          <w:color w:val="000000"/>
+          <w:sz w:val="20"/>
+        </w:rPr>
+        <w:t>Relationship is 1-3 year cadence (Indigenous procurement is relationship-driven, not open-bid) - start now, compound across phases.</w:t>
+      </w:r>
+    </w:p>
+    <w:p>
+      <w:pPr>
+        <w:spacing w:after="60"/>
+        <w:rPr>
+          <w:rFonts w:ascii="Calibri" w:hAnsi="Calibri" w:cs="Calibri"/>
+          <w:b/>
+          <w:color w:val="002060"/>
+        </w:rPr>
+      </w:pPr>
+      <w:r>
+        <w:rPr>
+          <w:rFonts w:ascii="Calibri" w:hAnsi="Calibri" w:cs="Calibri"/>
+          <w:b/>
+          <w:color w:val="002060"/>
+        </w:rPr>
+        <w:t>How this intelligence was gathered (2026-06-23)</w:t>
+      </w:r>
+    </w:p>
+    <w:p>
+      <w:pPr>
+        <w:spacing w:after="100"/>
+        <w:rPr>
+          <w:rFonts w:ascii="Calibri" w:hAnsi="Calibri" w:cs="Calibri"/>
+          <w:color w:val="000000"/>
+          <w:sz w:val="21"/>
+        </w:rPr>
+      </w:pPr>
+      <w:r>
+        <w:rPr>
+          <w:rFonts w:ascii="Calibri" w:hAnsi="Calibri" w:cs="Calibri"/>
+          <w:color w:val="000000"/>
+          <w:sz w:val="21"/>
+        </w:rPr>
+        <w:t>Web research (gwaiieng.com, islanderengineering.com, CCIB/CCAB listing, LinkedIn); Hunter.io domain-search (email pattern {f}{last}); Apollo.io people/match (verified emails; one wrong-company match auto-rejected by domain guard); Deltek linked-server check (no KOR client/vendor/contact history); and cross-reference against KOR's live MajorProjectsInventory pipeline for the shared owners. Ingested + deduped into the BD graph (CanonicalOrg 77585).</w:t>
+      </w:r>
+    </w:p>
+    <w:p>
+      <w:pPr>
+        <w:spacing w:after="100"/>
+        <w:rPr>
+          <w:rFonts w:ascii="Calibri" w:hAnsi="Calibri" w:cs="Calibri"/>
+          <w:color w:val="000000"/>
+          <w:sz w:val="21"/>
         </w:rPr>
       </w:pPr>
     </w:p>
@@ -1647,7 +2038,7 @@
     <w:link w:val="Heading1Char"/>
     <w:uiPriority w:val="9"/>
     <w:qFormat/>
-    <w:rsid w:val="00F908BF"/>
+    <w:rsid w:val="00B523EC"/>
     <w:pPr>
       <w:keepNext/>
       <w:keepLines/>
@@ -1670,7 +2061,7 @@
     <w:semiHidden/>
     <w:unhideWhenUsed/>
     <w:qFormat/>
-    <w:rsid w:val="00F908BF"/>
+    <w:rsid w:val="00B523EC"/>
     <w:pPr>
       <w:keepNext/>
       <w:keepLines/>
@@ -1693,7 +2084,7 @@
     <w:semiHidden/>
     <w:unhideWhenUsed/>
     <w:qFormat/>
-    <w:rsid w:val="00F908BF"/>
+    <w:rsid w:val="00B523EC"/>
     <w:pPr>
       <w:keepNext/>
       <w:keepLines/>
@@ -1716,7 +2107,7 @@
     <w:semiHidden/>
     <w:unhideWhenUsed/>
     <w:qFormat/>
-    <w:rsid w:val="00F908BF"/>
+    <w:rsid w:val="00B523EC"/>
     <w:pPr>
       <w:keepNext/>
       <w:keepLines/>
@@ -1739,7 +2130,7 @@
     <w:semiHidden/>
     <w:unhideWhenUsed/>
     <w:qFormat/>
-    <w:rsid w:val="00F908BF"/>
+    <w:rsid w:val="00B523EC"/>
     <w:pPr>
       <w:keepNext/>
       <w:keepLines/>
@@ -1760,7 +2151,7 @@
     <w:semiHidden/>
     <w:unhideWhenUsed/>
     <w:qFormat/>
-    <w:rsid w:val="00F908BF"/>
+    <w:rsid w:val="00B523EC"/>
     <w:pPr>
       <w:keepNext/>
       <w:keepLines/>
@@ -1783,7 +2174,7 @@
     <w:semiHidden/>
     <w:unhideWhenUsed/>
     <w:qFormat/>
-    <w:rsid w:val="00F908BF"/>
+    <w:rsid w:val="00B523EC"/>
     <w:pPr>
       <w:keepNext/>
       <w:keepLines/>
@@ -1804,7 +2195,7 @@
     <w:semiHidden/>
     <w:unhideWhenUsed/>
     <w:qFormat/>
-    <w:rsid w:val="00F908BF"/>
+    <w:rsid w:val="00B523EC"/>
     <w:pPr>
       <w:keepNext/>
       <w:keepLines/>
@@ -1827,7 +2218,7 @@
     <w:semiHidden/>
     <w:unhideWhenUsed/>
     <w:qFormat/>
-    <w:rsid w:val="00F908BF"/>
+    <w:rsid w:val="00B523EC"/>
     <w:pPr>
       <w:keepNext/>
       <w:keepLines/>
@@ -1871,7 +2262,7 @@
     <w:basedOn w:val="DefaultParagraphFont"/>
     <w:link w:val="Heading1"/>
     <w:uiPriority w:val="9"/>
-    <w:rsid w:val="00F908BF"/>
+    <w:rsid w:val="00B523EC"/>
     <w:rPr>
       <w:rFonts w:asciiTheme="majorHAnsi" w:eastAsiaTheme="majorEastAsia" w:hAnsiTheme="majorHAnsi" w:cstheme="majorBidi"/>
       <w:color w:val="0F4761" w:themeColor="accent1" w:themeShade="BF"/>
@@ -1885,7 +2276,7 @@
     <w:link w:val="Heading2"/>
     <w:uiPriority w:val="9"/>
     <w:semiHidden/>
-    <w:rsid w:val="00F908BF"/>
+    <w:rsid w:val="00B523EC"/>
     <w:rPr>
       <w:rFonts w:asciiTheme="majorHAnsi" w:eastAsiaTheme="majorEastAsia" w:hAnsiTheme="majorHAnsi" w:cstheme="majorBidi"/>
       <w:color w:val="0F4761" w:themeColor="accent1" w:themeShade="BF"/>
@@ -1899,7 +2290,7 @@
     <w:link w:val="Heading3"/>
     <w:uiPriority w:val="9"/>
     <w:semiHidden/>
-    <w:rsid w:val="00F908BF"/>
+    <w:rsid w:val="00B523EC"/>
     <w:rPr>
       <w:rFonts w:eastAsiaTheme="majorEastAsia" w:cstheme="majorBidi"/>
       <w:color w:val="0F4761" w:themeColor="accent1" w:themeShade="BF"/>
@@ -1913,7 +2304,7 @@
     <w:link w:val="Heading4"/>
     <w:uiPriority w:val="9"/>
     <w:semiHidden/>
-    <w:rsid w:val="00F908BF"/>
+    <w:rsid w:val="00B523EC"/>
     <w:rPr>
       <w:rFonts w:eastAsiaTheme="majorEastAsia" w:cstheme="majorBidi"/>
       <w:i/>
@@ -1927,7 +2318,7 @@
     <w:link w:val="Heading5"/>
     <w:uiPriority w:val="9"/>
     <w:semiHidden/>
-    <w:rsid w:val="00F908BF"/>
+    <w:rsid w:val="00B523EC"/>
     <w:rPr>
       <w:rFonts w:eastAsiaTheme="majorEastAsia" w:cstheme="majorBidi"/>
       <w:color w:val="0F4761" w:themeColor="accent1" w:themeShade="BF"/>
@@ -1939,7 +2330,7 @@
     <w:link w:val="Heading6"/>
     <w:uiPriority w:val="9"/>
     <w:semiHidden/>
-    <w:rsid w:val="00F908BF"/>
+    <w:rsid w:val="00B523EC"/>
     <w:rPr>
       <w:rFonts w:eastAsiaTheme="majorEastAsia" w:cstheme="majorBidi"/>
       <w:i/>
@@ -1953,7 +2344,7 @@
     <w:link w:val="Heading7"/>
     <w:uiPriority w:val="9"/>
     <w:semiHidden/>
-    <w:rsid w:val="00F908BF"/>
+    <w:rsid w:val="00B523EC"/>
     <w:rPr>
       <w:rFonts w:eastAsiaTheme="majorEastAsia" w:cstheme="majorBidi"/>
       <w:color w:val="595959" w:themeColor="text1" w:themeTint="A6"/>
@@ -1965,7 +2356,7 @@
     <w:link w:val="Heading8"/>
     <w:uiPriority w:val="9"/>
     <w:semiHidden/>
-    <w:rsid w:val="00F908BF"/>
+    <w:rsid w:val="00B523EC"/>
     <w:rPr>
       <w:rFonts w:eastAsiaTheme="majorEastAsia" w:cstheme="majorBidi"/>
       <w:i/>
@@ -1979,7 +2370,7 @@
     <w:link w:val="Heading9"/>
     <w:uiPriority w:val="9"/>
     <w:semiHidden/>
-    <w:rsid w:val="00F908BF"/>
+    <w:rsid w:val="00B523EC"/>
     <w:rPr>
       <w:rFonts w:eastAsiaTheme="majorEastAsia" w:cstheme="majorBidi"/>
       <w:color w:val="272727" w:themeColor="text1" w:themeTint="D8"/>
@@ -1992,7 +2383,7 @@
     <w:link w:val="TitleChar"/>
     <w:uiPriority w:val="10"/>
     <w:qFormat/>
-    <w:rsid w:val="00F908BF"/>
+    <w:rsid w:val="00B523EC"/>
     <w:pPr>
       <w:spacing w:after="80" w:line="240" w:lineRule="auto"/>
       <w:contextualSpacing/>
@@ -2010,7 +2401,7 @@
     <w:basedOn w:val="DefaultParagraphFont"/>
     <w:link w:val="Title"/>
     <w:uiPriority w:val="10"/>
-    <w:rsid w:val="00F908BF"/>
+    <w:rsid w:val="00B523EC"/>
     <w:rPr>
       <w:rFonts w:asciiTheme="majorHAnsi" w:eastAsiaTheme="majorEastAsia" w:hAnsiTheme="majorHAnsi" w:cstheme="majorBidi"/>
       <w:spacing w:val="-10"/>
@@ -2026,7 +2417,7 @@
     <w:link w:val="SubtitleChar"/>
     <w:uiPriority w:val="11"/>
     <w:qFormat/>
-    <w:rsid w:val="00F908BF"/>
+    <w:rsid w:val="00B523EC"/>
     <w:pPr>
       <w:numPr>
         <w:ilvl w:val="1"/>
@@ -2045,7 +2436,7 @@
     <w:basedOn w:val="DefaultParagraphFont"/>
     <w:link w:val="Subtitle"/>
     <w:uiPriority w:val="11"/>
-    <w:rsid w:val="00F908BF"/>
+    <w:rsid w:val="00B523EC"/>
     <w:rPr>
       <w:rFonts w:eastAsiaTheme="majorEastAsia" w:cstheme="majorBidi"/>
       <w:color w:val="595959" w:themeColor="text1" w:themeTint="A6"/>
@@ -2061,7 +2452,7 @@
     <w:link w:val="QuoteChar"/>
     <w:uiPriority w:val="29"/>
     <w:qFormat/>
-    <w:rsid w:val="00F908BF"/>
+    <w:rsid w:val="00B523EC"/>
     <w:pPr>
       <w:spacing w:before="160"/>
       <w:jc w:val="center"/>
@@ -2077,7 +2468,7 @@
     <w:basedOn w:val="DefaultParagraphFont"/>
     <w:link w:val="Quote"/>
     <w:uiPriority w:val="29"/>
-    <w:rsid w:val="00F908BF"/>
+    <w:rsid w:val="00B523EC"/>
     <w:rPr>
       <w:i/>
       <w:iCs/>
@@ -2089,7 +2480,7 @@
     <w:basedOn w:val="Normal"/>
     <w:uiPriority w:val="34"/>
     <w:qFormat/>
-    <w:rsid w:val="00F908BF"/>
+    <w:rsid w:val="00B523EC"/>
     <w:pPr>
       <w:ind w:left="720"/>
       <w:contextualSpacing/>
@@ -2100,7 +2491,7 @@
     <w:basedOn w:val="DefaultParagraphFont"/>
     <w:uiPriority w:val="21"/>
     <w:qFormat/>
-    <w:rsid w:val="00F908BF"/>
+    <w:rsid w:val="00B523EC"/>
     <w:rPr>
       <w:i/>
       <w:iCs/>
@@ -2114,7 +2505,7 @@
     <w:link w:val="IntenseQuoteChar"/>
     <w:uiPriority w:val="30"/>
     <w:qFormat/>
-    <w:rsid w:val="00F908BF"/>
+    <w:rsid w:val="00B523EC"/>
     <w:pPr>
       <w:pBdr>
         <w:top w:val="single" w:sz="4" w:space="10" w:color="0F4761" w:themeColor="accent1" w:themeShade="BF"/>
@@ -2135,7 +2526,7 @@
     <w:basedOn w:val="DefaultParagraphFont"/>
     <w:link w:val="IntenseQuote"/>
     <w:uiPriority w:val="30"/>
-    <w:rsid w:val="00F908BF"/>
+    <w:rsid w:val="00B523EC"/>
     <w:rPr>
       <w:i/>
       <w:iCs/>
@@ -2147,7 +2538,7 @@
     <w:basedOn w:val="DefaultParagraphFont"/>
     <w:uiPriority w:val="32"/>
     <w:qFormat/>
-    <w:rsid w:val="00F908BF"/>
+    <w:rsid w:val="00B523EC"/>
     <w:rPr>
       <w:b/>
       <w:bCs/>
@@ -2162,7 +2553,7 @@
     <w:link w:val="HeaderChar"/>
     <w:uiPriority w:val="99"/>
     <w:unhideWhenUsed/>
-    <w:rsid w:val="00F908BF"/>
+    <w:rsid w:val="00B523EC"/>
     <w:pPr>
       <w:tabs>
         <w:tab w:val="center" w:pos="4680"/>
@@ -2176,7 +2567,7 @@
     <w:basedOn w:val="DefaultParagraphFont"/>
     <w:link w:val="Header"/>
     <w:uiPriority w:val="99"/>
-    <w:rsid w:val="00F908BF"/>
+    <w:rsid w:val="00B523EC"/>
   </w:style>
   <w:style w:type="paragraph" w:styleId="Footer">
     <w:name w:val="footer"/>
@@ -2184,7 +2575,7 @@
     <w:link w:val="FooterChar"/>
     <w:uiPriority w:val="99"/>
     <w:unhideWhenUsed/>
-    <w:rsid w:val="00F908BF"/>
+    <w:rsid w:val="00B523EC"/>
     <w:pPr>
       <w:tabs>
         <w:tab w:val="center" w:pos="4680"/>
@@ -2198,7 +2589,7 @@
     <w:basedOn w:val="DefaultParagraphFont"/>
     <w:link w:val="Footer"/>
     <w:uiPriority w:val="99"/>
-    <w:rsid w:val="00F908BF"/>
+    <w:rsid w:val="00B523EC"/>
   </w:style>
 </w:styles>
 </file>

</xml_diff>

<commit_message>
docs(bd): bulk up Islander/Gwaii dossiers + answer Rory's defence past-performance Q
Expanded dossiers (Gwaii 3pp, Islander 2pp, exec 2pp): full civil service
scope, sectors/service area, founder credentials, Gwaii's FNIF/grants funding
differentiator. Added a Defence Canada proposal section answering Rory: KOR has
NO Deltek job history with Islander or Gwaii (cannot cite as past performance),
but DOES have active jobs with the other team members - Yellowridge Construction
(611 Brunswick St, Prince George) and dHKarchitects (All Clan House, Stellako BC).
Likely CFB Esquimalt (DCC A/B Jetty Recapitalization). Decomposed the finding
into IntelSignal on both orgs.

Co-Authored-By: Claude Opus 4.8 <noreply@anthropic.com>
</commit_message>
<xml_diff>
--- a/docs/KOR-Gwaii-Engineering-Dossier-2026-06-23.docx
+++ b/docs/KOR-Gwaii-Engineering-Dossier-2026-06-23.docx
@@ -122,7 +122,7 @@
           <w:color w:val="000000"/>
           <w:sz w:val="20"/>
         </w:rPr>
-        <w:t>Civil &amp; environmental engineering; water / wastewater; project &amp; construction management.</w:t>
+        <w:t>Civil &amp; environmental engineering; water / wastewater systems; stormwater &amp; drainage; site servicing.</w:t>
       </w:r>
     </w:p>
     <w:p>
@@ -150,7 +150,7 @@
           <w:color w:val="000000"/>
           <w:sz w:val="20"/>
         </w:rPr>
-        <w:t>Planning, funding &amp; finance advisory, and Indigenous procurement strategy.</w:t>
+        <w:t>Project &amp; construction management; community planning; funding &amp; finance advisory; Indigenous procurement strategy.</w:t>
       </w:r>
     </w:p>
     <w:p>
@@ -178,7 +178,35 @@
           <w:color w:val="000000"/>
           <w:sz w:val="20"/>
         </w:rPr>
-        <w:t>Sustainable energy (biofuel, solar, green energy), community energy retrofits, hazmat / mould surveys.</w:t>
+        <w:t>Sustainable / community energy (biofuel, solar, green energy) and community energy retrofits.</w:t>
+      </w:r>
+    </w:p>
+    <w:p>
+      <w:pPr>
+        <w:spacing w:after="80"/>
+        <w:ind w:left="280" w:hanging="280"/>
+        <w:rPr>
+          <w:rFonts w:ascii="Calibri" w:hAnsi="Calibri" w:cs="Calibri"/>
+          <w:color w:val="000000"/>
+          <w:sz w:val="20"/>
+        </w:rPr>
+      </w:pPr>
+      <w:r>
+        <w:rPr>
+          <w:rFonts w:ascii="Calibri" w:hAnsi="Calibri" w:cs="Calibri"/>
+          <w:b/>
+          <w:color w:val="002060"/>
+          <w:sz w:val="20"/>
+        </w:rPr>
+        <w:t xml:space="preserve">•  </w:t>
+      </w:r>
+      <w:r>
+        <w:rPr>
+          <w:rFonts w:ascii="Calibri" w:hAnsi="Calibri" w:cs="Calibri"/>
+          <w:color w:val="000000"/>
+          <w:sz w:val="20"/>
+        </w:rPr>
+        <w:t>Environmental: hazmat &amp; mould surveys, site remediation, and climate-adaptation infrastructure.</w:t>
       </w:r>
     </w:p>
     <w:p>
@@ -758,6 +786,60 @@
     </w:p>
     <w:p>
       <w:pPr>
+        <w:spacing w:after="100"/>
+        <w:rPr>
+          <w:rFonts w:ascii="Calibri" w:hAnsi="Calibri" w:cs="Calibri"/>
+          <w:color w:val="000000"/>
+          <w:sz w:val="21"/>
+        </w:rPr>
+      </w:pPr>
+      <w:r>
+        <w:rPr>
+          <w:rFonts w:ascii="Calibri" w:hAnsi="Calibri" w:cs="Calibri"/>
+          <w:color w:val="000000"/>
+          <w:sz w:val="21"/>
+        </w:rPr>
+        <w:t>Founder Corey Brown holds a civil-engineering technology diploma (Camosun College), a civil engineering degree (Lakehead University), and a UBC M.Eng. specializing in environmental fluid mechanics; P.Eng. Born in Old Masset, Haida Gwaii; member of the Sta'staas Eagle Clan.</w:t>
+      </w:r>
+    </w:p>
+    <w:p>
+      <w:pPr>
+        <w:spacing w:after="60"/>
+        <w:rPr>
+          <w:rFonts w:ascii="Calibri" w:hAnsi="Calibri" w:cs="Calibri"/>
+          <w:b/>
+          <w:color w:val="002060"/>
+        </w:rPr>
+      </w:pPr>
+      <w:r>
+        <w:rPr>
+          <w:rFonts w:ascii="Calibri" w:hAnsi="Calibri" w:cs="Calibri"/>
+          <w:b/>
+          <w:color w:val="002060"/>
+        </w:rPr>
+        <w:t>Funding &amp; grants advantage (a differentiator)</w:t>
+      </w:r>
+    </w:p>
+    <w:p>
+      <w:pPr>
+        <w:spacing w:after="100"/>
+        <w:rPr>
+          <w:rFonts w:ascii="Calibri" w:hAnsi="Calibri" w:cs="Calibri"/>
+          <w:color w:val="000000"/>
+          <w:sz w:val="21"/>
+        </w:rPr>
+      </w:pPr>
+      <w:r>
+        <w:rPr>
+          <w:rFonts w:ascii="Calibri" w:hAnsi="Calibri" w:cs="Calibri"/>
+          <w:color w:val="000000"/>
+          <w:sz w:val="21"/>
+        </w:rPr>
+        <w:t>Beyond design, Gwaii helps Nations SECURE the capital - advising on and structuring applications to the First Nation Infrastructure Fund (FNIF), Northern Development Economic Infrastructure grants, and federal/provincial climate-adaptation funds. For KOR this means Gwaii can bring FUNDED, shovel-ready Nation projects to a team, not just engineer them - a meaningful edge when partnering on Indigenous pursuits.</w:t>
+      </w:r>
+    </w:p>
+    <w:p>
+      <w:pPr>
         <w:spacing w:after="60"/>
         <w:rPr>
           <w:rFonts w:ascii="Calibri" w:hAnsi="Calibri" w:cs="Calibri"/>
@@ -939,6 +1021,7 @@
           <w:color w:val="002060"/>
           <w:sz w:val="20"/>
         </w:rPr>
+        <w:lastRenderedPageBreak/>
         <w:t xml:space="preserve">•  </w:t>
       </w:r>
       <w:r>
@@ -1125,7 +1208,6 @@
           <w:color w:val="002060"/>
           <w:sz w:val="20"/>
         </w:rPr>
-        <w:lastRenderedPageBreak/>
         <w:t xml:space="preserve">•  </w:t>
       </w:r>
       <w:r>
@@ -1180,7 +1262,7 @@
           <w:b/>
           <w:color w:val="002060"/>
         </w:rPr>
-        <w:t>Live teaming triggers (KOR pursuits on Gwaii-client land)</w:t>
+        <w:t>Defence Canada proposal - team &amp; KOR past-performance check (for Rory)</w:t>
       </w:r>
     </w:p>
     <w:p>
@@ -1198,7 +1280,7 @@
           <w:color w:val="000000"/>
           <w:sz w:val="21"/>
         </w:rPr>
-        <w:t>KOR is ALREADY pursuing projects whose owners are Gwaii's incumbent clients - these are the immediate, named teaming triggers:</w:t>
+        <w:t>A Defence Canada / DCC proposal is forming with Yellowridge Construction (GC) and DHK Architects - likely Vancouver Island (DCC's active CFB Esquimalt program is the A/B Jetty Recapitalization). Past-performance check from KOR's Deltek:</w:t>
       </w:r>
     </w:p>
     <w:p>
@@ -1226,7 +1308,7 @@
           <w:color w:val="000000"/>
           <w:sz w:val="20"/>
         </w:rPr>
-        <w:t>Duncan 'River's Edge' - Cowichan Tribes + BC Housing (Cowichan is a Gwaii client).</w:t>
+        <w:t>KOR has NO completed or active jobs with Gwaii Engineering - confirmed absent from Deltek (no client, vendor, project or contact record). Gwaii CANNOT be cited as KOR past-performance.</w:t>
       </w:r>
     </w:p>
     <w:p>
@@ -1254,7 +1336,7 @@
           <w:color w:val="000000"/>
           <w:sz w:val="20"/>
         </w:rPr>
-        <w:t>Saanichton - Tsawout First Nation, 7593 Tetayut Rd (Tsawout is a Gwaii client).</w:t>
+        <w:t>KOR HAS active jobs with the OTHER team members: Yellowridge Construction (611 Brunswick St, Prince George) and dHKarchitects (All Clan House, Stellako BC - an Indigenous Clan House project). Those are the citable KOR-team references.</w:t>
       </w:r>
     </w:p>
     <w:p>
@@ -1282,7 +1364,43 @@
           <w:color w:val="000000"/>
           <w:sz w:val="20"/>
         </w:rPr>
-        <w:t>Penticton - Skaha Assembly Redevelopment (PURSUE_URGENT; Indigenous / BC Housing lane).</w:t>
+        <w:t>Gwaii's value to this proposal is forward-looking: an Indigenous-owned (CCAB) civil partner with coastal-BC Nation relationships - strong for a DND / Indigenous-adjacent pursuit, but as a NEW teaming arrangement, not prior performance.</w:t>
+      </w:r>
+    </w:p>
+    <w:p>
+      <w:pPr>
+        <w:spacing w:after="60"/>
+        <w:rPr>
+          <w:rFonts w:ascii="Calibri" w:hAnsi="Calibri" w:cs="Calibri"/>
+          <w:b/>
+          <w:color w:val="002060"/>
+        </w:rPr>
+      </w:pPr>
+      <w:r>
+        <w:rPr>
+          <w:rFonts w:ascii="Calibri" w:hAnsi="Calibri" w:cs="Calibri"/>
+          <w:b/>
+          <w:color w:val="002060"/>
+        </w:rPr>
+        <w:t>Live teaming triggers (KOR pursuits on Gwaii-client land)</w:t>
+      </w:r>
+    </w:p>
+    <w:p>
+      <w:pPr>
+        <w:spacing w:after="100"/>
+        <w:rPr>
+          <w:rFonts w:ascii="Calibri" w:hAnsi="Calibri" w:cs="Calibri"/>
+          <w:color w:val="000000"/>
+          <w:sz w:val="21"/>
+        </w:rPr>
+      </w:pPr>
+      <w:r>
+        <w:rPr>
+          <w:rFonts w:ascii="Calibri" w:hAnsi="Calibri" w:cs="Calibri"/>
+          <w:color w:val="000000"/>
+          <w:sz w:val="21"/>
+        </w:rPr>
+        <w:t>KOR is ALREADY pursuing projects whose owners are Gwaii's incumbent clients - these are the immediate, named teaming triggers:</w:t>
       </w:r>
     </w:p>
     <w:p>
@@ -1310,25 +1428,7 @@
           <w:color w:val="000000"/>
           <w:sz w:val="20"/>
         </w:rPr>
-        <w:t>Vancouver Island BC Housing wave - Nanaimo (250 Terminal Ave, Fifth Street, 1030 Old Victoria Rd), Saanich (3690 Richmond Rd), Campbell River (Robron Village) - Gwaii's home geography.</w:t>
-      </w:r>
-    </w:p>
-    <w:p>
-      <w:pPr>
-        <w:spacing w:after="60"/>
-        <w:rPr>
-          <w:rFonts w:ascii="Calibri" w:hAnsi="Calibri" w:cs="Calibri"/>
-          <w:b/>
-          <w:color w:val="002060"/>
-        </w:rPr>
-      </w:pPr>
-      <w:r>
-        <w:rPr>
-          <w:rFonts w:ascii="Calibri" w:hAnsi="Calibri" w:cs="Calibri"/>
-          <w:b/>
-          <w:color w:val="002060"/>
-        </w:rPr>
-        <w:t>Talking points for Rory</w:t>
+        <w:t>Duncan 'River's Edge' - Cowichan Tribes + BC Housing (Cowichan is a Gwaii client).</w:t>
       </w:r>
     </w:p>
     <w:p>
@@ -1356,7 +1456,7 @@
           <w:color w:val="000000"/>
           <w:sz w:val="20"/>
         </w:rPr>
-        <w:t>Lead with complement, not competition: KOR is structural, Gwaii is civil/environmental - the disciplines pair on the same teams and never bid against each other.</w:t>
+        <w:t>Saanichton - Tsawout First Nation, 7593 Tetayut Rd (Tsawout is a Gwaii client).</w:t>
       </w:r>
     </w:p>
     <w:p>
@@ -1384,7 +1484,7 @@
           <w:color w:val="000000"/>
           <w:sz w:val="20"/>
         </w:rPr>
-        <w:t>Indigenous-participation angle: a KOR structural + Gwaii civil team earns CCAB / Indigenous-participation scoring on public RFQs, where Gwaii is already the incumbent civil engineer and KOR supplies structural depth Gwaii does not hold in-house.</w:t>
+        <w:t>Penticton - Skaha Assembly Redevelopment (PURSUE_URGENT; Indigenous / BC Housing lane).</w:t>
       </w:r>
     </w:p>
     <w:p>
@@ -1404,6 +1504,109 @@
           <w:color w:val="002060"/>
           <w:sz w:val="20"/>
         </w:rPr>
+        <w:t xml:space="preserve">•  </w:t>
+      </w:r>
+      <w:r>
+        <w:rPr>
+          <w:rFonts w:ascii="Calibri" w:hAnsi="Calibri" w:cs="Calibri"/>
+          <w:color w:val="000000"/>
+          <w:sz w:val="20"/>
+        </w:rPr>
+        <w:t>Vancouver Island BC Housing wave - Nanaimo (250 Terminal Ave, Fifth Street, 1030 Old Victoria Rd), Saanich (3690 Richmond Rd), Campbell River (Robron Village) - Gwaii's home geography.</w:t>
+      </w:r>
+    </w:p>
+    <w:p>
+      <w:pPr>
+        <w:spacing w:after="60"/>
+        <w:rPr>
+          <w:rFonts w:ascii="Calibri" w:hAnsi="Calibri" w:cs="Calibri"/>
+          <w:b/>
+          <w:color w:val="002060"/>
+        </w:rPr>
+      </w:pPr>
+      <w:r>
+        <w:rPr>
+          <w:rFonts w:ascii="Calibri" w:hAnsi="Calibri" w:cs="Calibri"/>
+          <w:b/>
+          <w:color w:val="002060"/>
+        </w:rPr>
+        <w:t>Talking points for Rory</w:t>
+      </w:r>
+    </w:p>
+    <w:p>
+      <w:pPr>
+        <w:spacing w:after="80"/>
+        <w:ind w:left="280" w:hanging="280"/>
+        <w:rPr>
+          <w:rFonts w:ascii="Calibri" w:hAnsi="Calibri" w:cs="Calibri"/>
+          <w:color w:val="000000"/>
+          <w:sz w:val="20"/>
+        </w:rPr>
+      </w:pPr>
+      <w:r>
+        <w:rPr>
+          <w:rFonts w:ascii="Calibri" w:hAnsi="Calibri" w:cs="Calibri"/>
+          <w:b/>
+          <w:color w:val="002060"/>
+          <w:sz w:val="20"/>
+        </w:rPr>
+        <w:t xml:space="preserve">•  </w:t>
+      </w:r>
+      <w:r>
+        <w:rPr>
+          <w:rFonts w:ascii="Calibri" w:hAnsi="Calibri" w:cs="Calibri"/>
+          <w:color w:val="000000"/>
+          <w:sz w:val="20"/>
+        </w:rPr>
+        <w:t>Lead with complement, not competition: KOR is structural, Gwaii is civil/environmental - the disciplines pair on the same teams and never bid against each other.</w:t>
+      </w:r>
+    </w:p>
+    <w:p>
+      <w:pPr>
+        <w:spacing w:after="80"/>
+        <w:ind w:left="280" w:hanging="280"/>
+        <w:rPr>
+          <w:rFonts w:ascii="Calibri" w:hAnsi="Calibri" w:cs="Calibri"/>
+          <w:color w:val="000000"/>
+          <w:sz w:val="20"/>
+        </w:rPr>
+      </w:pPr>
+      <w:r>
+        <w:rPr>
+          <w:rFonts w:ascii="Calibri" w:hAnsi="Calibri" w:cs="Calibri"/>
+          <w:b/>
+          <w:color w:val="002060"/>
+          <w:sz w:val="20"/>
+        </w:rPr>
+        <w:t xml:space="preserve">•  </w:t>
+      </w:r>
+      <w:r>
+        <w:rPr>
+          <w:rFonts w:ascii="Calibri" w:hAnsi="Calibri" w:cs="Calibri"/>
+          <w:color w:val="000000"/>
+          <w:sz w:val="20"/>
+        </w:rPr>
+        <w:t>Indigenous-participation angle: a KOR structural + Gwaii civil team earns CCAB / Indigenous-participation scoring on public RFQs, where Gwaii is already the incumbent civil engineer and KOR supplies structural depth Gwaii does not hold in-house.</w:t>
+      </w:r>
+    </w:p>
+    <w:p>
+      <w:pPr>
+        <w:spacing w:after="80"/>
+        <w:ind w:left="280" w:hanging="280"/>
+        <w:rPr>
+          <w:rFonts w:ascii="Calibri" w:hAnsi="Calibri" w:cs="Calibri"/>
+          <w:color w:val="000000"/>
+          <w:sz w:val="20"/>
+        </w:rPr>
+      </w:pPr>
+      <w:r>
+        <w:rPr>
+          <w:rFonts w:ascii="Calibri" w:hAnsi="Calibri" w:cs="Calibri"/>
+          <w:b/>
+          <w:color w:val="002060"/>
+          <w:sz w:val="20"/>
+        </w:rPr>
+        <w:lastRenderedPageBreak/>
         <w:t xml:space="preserve">•  </w:t>
       </w:r>
       <w:r>
@@ -2038,7 +2241,7 @@
     <w:link w:val="Heading1Char"/>
     <w:uiPriority w:val="9"/>
     <w:qFormat/>
-    <w:rsid w:val="00B523EC"/>
+    <w:rsid w:val="00A828E5"/>
     <w:pPr>
       <w:keepNext/>
       <w:keepLines/>
@@ -2061,7 +2264,7 @@
     <w:semiHidden/>
     <w:unhideWhenUsed/>
     <w:qFormat/>
-    <w:rsid w:val="00B523EC"/>
+    <w:rsid w:val="00A828E5"/>
     <w:pPr>
       <w:keepNext/>
       <w:keepLines/>
@@ -2084,7 +2287,7 @@
     <w:semiHidden/>
     <w:unhideWhenUsed/>
     <w:qFormat/>
-    <w:rsid w:val="00B523EC"/>
+    <w:rsid w:val="00A828E5"/>
     <w:pPr>
       <w:keepNext/>
       <w:keepLines/>
@@ -2107,7 +2310,7 @@
     <w:semiHidden/>
     <w:unhideWhenUsed/>
     <w:qFormat/>
-    <w:rsid w:val="00B523EC"/>
+    <w:rsid w:val="00A828E5"/>
     <w:pPr>
       <w:keepNext/>
       <w:keepLines/>
@@ -2130,7 +2333,7 @@
     <w:semiHidden/>
     <w:unhideWhenUsed/>
     <w:qFormat/>
-    <w:rsid w:val="00B523EC"/>
+    <w:rsid w:val="00A828E5"/>
     <w:pPr>
       <w:keepNext/>
       <w:keepLines/>
@@ -2151,7 +2354,7 @@
     <w:semiHidden/>
     <w:unhideWhenUsed/>
     <w:qFormat/>
-    <w:rsid w:val="00B523EC"/>
+    <w:rsid w:val="00A828E5"/>
     <w:pPr>
       <w:keepNext/>
       <w:keepLines/>
@@ -2174,7 +2377,7 @@
     <w:semiHidden/>
     <w:unhideWhenUsed/>
     <w:qFormat/>
-    <w:rsid w:val="00B523EC"/>
+    <w:rsid w:val="00A828E5"/>
     <w:pPr>
       <w:keepNext/>
       <w:keepLines/>
@@ -2195,7 +2398,7 @@
     <w:semiHidden/>
     <w:unhideWhenUsed/>
     <w:qFormat/>
-    <w:rsid w:val="00B523EC"/>
+    <w:rsid w:val="00A828E5"/>
     <w:pPr>
       <w:keepNext/>
       <w:keepLines/>
@@ -2218,7 +2421,7 @@
     <w:semiHidden/>
     <w:unhideWhenUsed/>
     <w:qFormat/>
-    <w:rsid w:val="00B523EC"/>
+    <w:rsid w:val="00A828E5"/>
     <w:pPr>
       <w:keepNext/>
       <w:keepLines/>
@@ -2262,7 +2465,7 @@
     <w:basedOn w:val="DefaultParagraphFont"/>
     <w:link w:val="Heading1"/>
     <w:uiPriority w:val="9"/>
-    <w:rsid w:val="00B523EC"/>
+    <w:rsid w:val="00A828E5"/>
     <w:rPr>
       <w:rFonts w:asciiTheme="majorHAnsi" w:eastAsiaTheme="majorEastAsia" w:hAnsiTheme="majorHAnsi" w:cstheme="majorBidi"/>
       <w:color w:val="0F4761" w:themeColor="accent1" w:themeShade="BF"/>
@@ -2276,7 +2479,7 @@
     <w:link w:val="Heading2"/>
     <w:uiPriority w:val="9"/>
     <w:semiHidden/>
-    <w:rsid w:val="00B523EC"/>
+    <w:rsid w:val="00A828E5"/>
     <w:rPr>
       <w:rFonts w:asciiTheme="majorHAnsi" w:eastAsiaTheme="majorEastAsia" w:hAnsiTheme="majorHAnsi" w:cstheme="majorBidi"/>
       <w:color w:val="0F4761" w:themeColor="accent1" w:themeShade="BF"/>
@@ -2290,7 +2493,7 @@
     <w:link w:val="Heading3"/>
     <w:uiPriority w:val="9"/>
     <w:semiHidden/>
-    <w:rsid w:val="00B523EC"/>
+    <w:rsid w:val="00A828E5"/>
     <w:rPr>
       <w:rFonts w:eastAsiaTheme="majorEastAsia" w:cstheme="majorBidi"/>
       <w:color w:val="0F4761" w:themeColor="accent1" w:themeShade="BF"/>
@@ -2304,7 +2507,7 @@
     <w:link w:val="Heading4"/>
     <w:uiPriority w:val="9"/>
     <w:semiHidden/>
-    <w:rsid w:val="00B523EC"/>
+    <w:rsid w:val="00A828E5"/>
     <w:rPr>
       <w:rFonts w:eastAsiaTheme="majorEastAsia" w:cstheme="majorBidi"/>
       <w:i/>
@@ -2318,7 +2521,7 @@
     <w:link w:val="Heading5"/>
     <w:uiPriority w:val="9"/>
     <w:semiHidden/>
-    <w:rsid w:val="00B523EC"/>
+    <w:rsid w:val="00A828E5"/>
     <w:rPr>
       <w:rFonts w:eastAsiaTheme="majorEastAsia" w:cstheme="majorBidi"/>
       <w:color w:val="0F4761" w:themeColor="accent1" w:themeShade="BF"/>
@@ -2330,7 +2533,7 @@
     <w:link w:val="Heading6"/>
     <w:uiPriority w:val="9"/>
     <w:semiHidden/>
-    <w:rsid w:val="00B523EC"/>
+    <w:rsid w:val="00A828E5"/>
     <w:rPr>
       <w:rFonts w:eastAsiaTheme="majorEastAsia" w:cstheme="majorBidi"/>
       <w:i/>
@@ -2344,7 +2547,7 @@
     <w:link w:val="Heading7"/>
     <w:uiPriority w:val="9"/>
     <w:semiHidden/>
-    <w:rsid w:val="00B523EC"/>
+    <w:rsid w:val="00A828E5"/>
     <w:rPr>
       <w:rFonts w:eastAsiaTheme="majorEastAsia" w:cstheme="majorBidi"/>
       <w:color w:val="595959" w:themeColor="text1" w:themeTint="A6"/>
@@ -2356,7 +2559,7 @@
     <w:link w:val="Heading8"/>
     <w:uiPriority w:val="9"/>
     <w:semiHidden/>
-    <w:rsid w:val="00B523EC"/>
+    <w:rsid w:val="00A828E5"/>
     <w:rPr>
       <w:rFonts w:eastAsiaTheme="majorEastAsia" w:cstheme="majorBidi"/>
       <w:i/>
@@ -2370,7 +2573,7 @@
     <w:link w:val="Heading9"/>
     <w:uiPriority w:val="9"/>
     <w:semiHidden/>
-    <w:rsid w:val="00B523EC"/>
+    <w:rsid w:val="00A828E5"/>
     <w:rPr>
       <w:rFonts w:eastAsiaTheme="majorEastAsia" w:cstheme="majorBidi"/>
       <w:color w:val="272727" w:themeColor="text1" w:themeTint="D8"/>
@@ -2383,7 +2586,7 @@
     <w:link w:val="TitleChar"/>
     <w:uiPriority w:val="10"/>
     <w:qFormat/>
-    <w:rsid w:val="00B523EC"/>
+    <w:rsid w:val="00A828E5"/>
     <w:pPr>
       <w:spacing w:after="80" w:line="240" w:lineRule="auto"/>
       <w:contextualSpacing/>
@@ -2401,7 +2604,7 @@
     <w:basedOn w:val="DefaultParagraphFont"/>
     <w:link w:val="Title"/>
     <w:uiPriority w:val="10"/>
-    <w:rsid w:val="00B523EC"/>
+    <w:rsid w:val="00A828E5"/>
     <w:rPr>
       <w:rFonts w:asciiTheme="majorHAnsi" w:eastAsiaTheme="majorEastAsia" w:hAnsiTheme="majorHAnsi" w:cstheme="majorBidi"/>
       <w:spacing w:val="-10"/>
@@ -2417,7 +2620,7 @@
     <w:link w:val="SubtitleChar"/>
     <w:uiPriority w:val="11"/>
     <w:qFormat/>
-    <w:rsid w:val="00B523EC"/>
+    <w:rsid w:val="00A828E5"/>
     <w:pPr>
       <w:numPr>
         <w:ilvl w:val="1"/>
@@ -2436,7 +2639,7 @@
     <w:basedOn w:val="DefaultParagraphFont"/>
     <w:link w:val="Subtitle"/>
     <w:uiPriority w:val="11"/>
-    <w:rsid w:val="00B523EC"/>
+    <w:rsid w:val="00A828E5"/>
     <w:rPr>
       <w:rFonts w:eastAsiaTheme="majorEastAsia" w:cstheme="majorBidi"/>
       <w:color w:val="595959" w:themeColor="text1" w:themeTint="A6"/>
@@ -2452,7 +2655,7 @@
     <w:link w:val="QuoteChar"/>
     <w:uiPriority w:val="29"/>
     <w:qFormat/>
-    <w:rsid w:val="00B523EC"/>
+    <w:rsid w:val="00A828E5"/>
     <w:pPr>
       <w:spacing w:before="160"/>
       <w:jc w:val="center"/>
@@ -2468,7 +2671,7 @@
     <w:basedOn w:val="DefaultParagraphFont"/>
     <w:link w:val="Quote"/>
     <w:uiPriority w:val="29"/>
-    <w:rsid w:val="00B523EC"/>
+    <w:rsid w:val="00A828E5"/>
     <w:rPr>
       <w:i/>
       <w:iCs/>
@@ -2480,7 +2683,7 @@
     <w:basedOn w:val="Normal"/>
     <w:uiPriority w:val="34"/>
     <w:qFormat/>
-    <w:rsid w:val="00B523EC"/>
+    <w:rsid w:val="00A828E5"/>
     <w:pPr>
       <w:ind w:left="720"/>
       <w:contextualSpacing/>
@@ -2491,7 +2694,7 @@
     <w:basedOn w:val="DefaultParagraphFont"/>
     <w:uiPriority w:val="21"/>
     <w:qFormat/>
-    <w:rsid w:val="00B523EC"/>
+    <w:rsid w:val="00A828E5"/>
     <w:rPr>
       <w:i/>
       <w:iCs/>
@@ -2505,7 +2708,7 @@
     <w:link w:val="IntenseQuoteChar"/>
     <w:uiPriority w:val="30"/>
     <w:qFormat/>
-    <w:rsid w:val="00B523EC"/>
+    <w:rsid w:val="00A828E5"/>
     <w:pPr>
       <w:pBdr>
         <w:top w:val="single" w:sz="4" w:space="10" w:color="0F4761" w:themeColor="accent1" w:themeShade="BF"/>
@@ -2526,7 +2729,7 @@
     <w:basedOn w:val="DefaultParagraphFont"/>
     <w:link w:val="IntenseQuote"/>
     <w:uiPriority w:val="30"/>
-    <w:rsid w:val="00B523EC"/>
+    <w:rsid w:val="00A828E5"/>
     <w:rPr>
       <w:i/>
       <w:iCs/>
@@ -2538,7 +2741,7 @@
     <w:basedOn w:val="DefaultParagraphFont"/>
     <w:uiPriority w:val="32"/>
     <w:qFormat/>
-    <w:rsid w:val="00B523EC"/>
+    <w:rsid w:val="00A828E5"/>
     <w:rPr>
       <w:b/>
       <w:bCs/>
@@ -2553,7 +2756,7 @@
     <w:link w:val="HeaderChar"/>
     <w:uiPriority w:val="99"/>
     <w:unhideWhenUsed/>
-    <w:rsid w:val="00B523EC"/>
+    <w:rsid w:val="00A828E5"/>
     <w:pPr>
       <w:tabs>
         <w:tab w:val="center" w:pos="4680"/>
@@ -2567,7 +2770,7 @@
     <w:basedOn w:val="DefaultParagraphFont"/>
     <w:link w:val="Header"/>
     <w:uiPriority w:val="99"/>
-    <w:rsid w:val="00B523EC"/>
+    <w:rsid w:val="00A828E5"/>
   </w:style>
   <w:style w:type="paragraph" w:styleId="Footer">
     <w:name w:val="footer"/>
@@ -2575,7 +2778,7 @@
     <w:link w:val="FooterChar"/>
     <w:uiPriority w:val="99"/>
     <w:unhideWhenUsed/>
-    <w:rsid w:val="00B523EC"/>
+    <w:rsid w:val="00A828E5"/>
     <w:pPr>
       <w:tabs>
         <w:tab w:val="center" w:pos="4680"/>
@@ -2589,7 +2792,7 @@
     <w:basedOn w:val="DefaultParagraphFont"/>
     <w:link w:val="Footer"/>
     <w:uiPriority w:val="99"/>
-    <w:rsid w:val="00B523EC"/>
+    <w:rsid w:val="00A828E5"/>
   </w:style>
 </w:styles>
 </file>

</xml_diff>